<commit_message>
docs(informes): informe 4a, pruebas de sistema; estado de integración actualizado tras la fusión de IT-01 [ISO/IEC/IEEE 29119-3] [DIS-33]
Co-Authored-By: Claude Opus 5.5 <noreply@anthropic.com>
</commit_message>
<xml_diff>
--- a/docs/informes/Informe1_SOLID_AbasteceNi_v1.0.docx
+++ b/docs/informes/Informe1_SOLID_AbasteceNi_v1.0.docx
@@ -1207,7 +1207,28 @@
         <w:jc w:val="both"/>
       </w:pPr>
       <w:r>
-        <w:t xml:space="preserve">El alcance vigente es el de las iteraciones IT-00, IT-01 e IT-02 (tramo A) del documento 4 (D4 §2.13). Conforme a la Definición de Terminado (DM-04, condiciones 5 y 6), un elemento solo forma parte del incremento cuando la revisión cruzada consta como favorable y está integrado en la rama principal con la batería en verde. A la fecha de este informe el estado es el siguiente, y cada afirmación del Desarrollo indica a cuál de estos estados pertenece:</w:t>
+        <w:t xml:space="preserve">El alcance vigente es el de las iteraciones IT-00, IT-01 e IT-02 (tramo A) del documento 4 (D4 §2.13). Conforme a la Definición de Terminado (DM-04, condiciones 5 y 6), un elemento solo forma parte del incremento cuando la revisión cruzada consta como favorable y está integrado en la rama principal con la batería en verde. IT-00 e IT-01 están integradas en </w:t>
+      </w:r>
+      <w:r>
+        <w:rPr>
+          <w:rFonts w:ascii="Consolas" w:cs="Consolas" w:eastAsia="Consolas" w:hAnsi="Consolas"/>
+          <w:sz w:val="20"/>
+          <w:szCs w:val="20"/>
+        </w:rPr>
+        <w:t xml:space="preserve">main</w:t>
+      </w:r>
+      <w:r>
+        <w:t xml:space="preserve"> (PR #1 y #2). IT-02 (tramo A) está </w:t>
+      </w:r>
+      <w:r>
+        <w:rPr>
+          <w:b/>
+          <w:bCs/>
+        </w:rPr>
+        <w:t xml:space="preserve">construida y verificada, pendiente de la revisión cruzada</w:t>
+      </w:r>
+      <w:r>
+        <w:t xml:space="preserve"> (PR #3) para integrarse (DM-04, condiciones 5 y 6), y por eso se presenta como construida en rama y no como parte del incremento integrado. Cada afirmación del Desarrollo indica a qué iteración pertenece:</w:t>
       </w:r>
     </w:p>
     <w:tbl>
@@ -1638,7 +1659,37 @@
                 <w:sz w:val="18"/>
                 <w:szCs w:val="18"/>
               </w:rPr>
-              <w:t xml:space="preserve">Construida y verificada; pendiente de la revisión cruzada (DM-05) para integrarse</w:t>
+              <w:t xml:space="preserve">Integrada en </w:t>
+            </w:r>
+            <w:r>
+              <w:rPr>
+                <w:rFonts w:ascii="Consolas" w:cs="Consolas" w:eastAsia="Consolas" w:hAnsi="Consolas"/>
+                <w:sz w:val="18"/>
+                <w:szCs w:val="18"/>
+              </w:rPr>
+              <w:t xml:space="preserve">main</w:t>
+            </w:r>
+            <w:r>
+              <w:rPr>
+                <w:sz w:val="18"/>
+                <w:szCs w:val="18"/>
+              </w:rPr>
+              <w:t xml:space="preserve"> (commit de fusión </w:t>
+            </w:r>
+            <w:r>
+              <w:rPr>
+                <w:rFonts w:ascii="Consolas" w:cs="Consolas" w:eastAsia="Consolas" w:hAnsi="Consolas"/>
+                <w:sz w:val="18"/>
+                <w:szCs w:val="18"/>
+              </w:rPr>
+              <w:t xml:space="preserve">8d1845e</w:t>
+            </w:r>
+            <w:r>
+              <w:rPr>
+                <w:sz w:val="18"/>
+                <w:szCs w:val="18"/>
+              </w:rPr>
+              <w:t xml:space="preserve">)</w:t>
             </w:r>
           </w:p>
         </w:tc>
@@ -1706,7 +1757,7 @@
                 <w:sz w:val="18"/>
                 <w:szCs w:val="18"/>
               </w:rPr>
-              <w:t xml:space="preserve"> — PR #4</w:t>
+              <w:t xml:space="preserve"> — PR #3</w:t>
             </w:r>
           </w:p>
         </w:tc>
@@ -8304,7 +8355,7 @@
                 <w:sz w:val="18"/>
                 <w:szCs w:val="18"/>
               </w:rPr>
-              <w:t xml:space="preserve">Pendiente de revisión cruzada (PR #2)</w:t>
+              <w:t xml:space="preserve">Integrado (PR #2)</w:t>
             </w:r>
           </w:p>
         </w:tc>
@@ -8451,7 +8502,7 @@
                 <w:sz w:val="18"/>
                 <w:szCs w:val="18"/>
               </w:rPr>
-              <w:t xml:space="preserve">Pendiente de revisión cruzada (PR #4)</w:t>
+              <w:t xml:space="preserve">Pendiente de revisión cruzada (PR #3)</w:t>
             </w:r>
           </w:p>
         </w:tc>
@@ -8598,7 +8649,7 @@
                 <w:sz w:val="18"/>
                 <w:szCs w:val="18"/>
               </w:rPr>
-              <w:t xml:space="preserve">Pendiente (PR #2 y #4)</w:t>
+              <w:t xml:space="preserve">IT-01 integrado; IT-02 pendiente (PR #3)</w:t>
             </w:r>
           </w:p>
         </w:tc>
@@ -8757,7 +8808,7 @@
         <w:jc w:val="both"/>
       </w:pPr>
       <w:r>
-        <w:t xml:space="preserve">Los elementos de IT-01 e IT-02 están construidos y su verificación está en verde en la CI de sus ramas, pero </w:t>
+        <w:t xml:space="preserve">Los elementos de IT-02 están construidos y su verificación está en verde en la CI de su rama, pero </w:t>
       </w:r>
       <w:r>
         <w:rPr>

</xml_diff>

<commit_message>
docs(informes): informe 6, repositorio y gestión de la configuración; viñetas visibles en los seis informes [ISO/IEC/IEEE 12207] [ISO/IEC 29110]
Co-Authored-By: Claude Opus 5.5 <noreply@anthropic.com>
</commit_message>
<xml_diff>
--- a/docs/informes/Informe1_SOLID_AbasteceNi_v1.0.docx
+++ b/docs/informes/Informe1_SOLID_AbasteceNi_v1.0.docx
@@ -7279,10 +7279,178 @@
         <w:t xml:space="preserve">:</w:t>
       </w:r>
     </w:p>
-    <rootKey>w:p</rootKey>
-    <rootKey>w:p</rootKey>
-    <rootKey>w:p</rootKey>
-    <rootKey>w:p</rootKey>
+    <w:p>
+      <w:pPr>
+        <w:pStyle w:val="ListParagraph"/>
+        <w:numPr>
+          <w:ilvl w:val="0"/>
+          <w:numId w:val="2"/>
+        </w:numPr>
+        <w:spacing w:after="60"/>
+        <w:jc w:val="left"/>
+      </w:pPr>
+      <w:r>
+        <w:rPr>
+          <w:b/>
+          <w:bCs/>
+        </w:rPr>
+        <w:t xml:space="preserve">Un puerto de persistencia por módulo:</w:t>
+      </w:r>
+      <w:r>
+        <w:t xml:space="preserve"> </w:t>
+      </w:r>
+      <w:r>
+        <w:rPr>
+          <w:rFonts w:ascii="Consolas" w:cs="Consolas" w:eastAsia="Consolas" w:hAnsi="Consolas"/>
+          <w:sz w:val="20"/>
+          <w:szCs w:val="20"/>
+        </w:rPr>
+        <w:t xml:space="preserve">PuertoRepositorioUsuarios</w:t>
+      </w:r>
+      <w:r>
+        <w:t xml:space="preserve"> (M1) y </w:t>
+      </w:r>
+      <w:r>
+        <w:rPr>
+          <w:rFonts w:ascii="Consolas" w:cs="Consolas" w:eastAsia="Consolas" w:hAnsi="Consolas"/>
+          <w:sz w:val="20"/>
+          <w:szCs w:val="20"/>
+        </w:rPr>
+        <w:t xml:space="preserve">PuertoRepositorioSeguridad</w:t>
+      </w:r>
+      <w:r>
+        <w:t xml:space="preserve"> (M2), en lugar de uno por agregado.</w:t>
+      </w:r>
+    </w:p>
+    <w:p>
+      <w:pPr>
+        <w:pStyle w:val="ListParagraph"/>
+        <w:numPr>
+          <w:ilvl w:val="0"/>
+          <w:numId w:val="2"/>
+        </w:numPr>
+        <w:spacing w:after="60"/>
+        <w:jc w:val="left"/>
+      </w:pPr>
+      <w:r>
+        <w:rPr>
+          <w:b/>
+          <w:bCs/>
+        </w:rPr>
+        <w:t xml:space="preserve">Un servicio por módulo:</w:t>
+      </w:r>
+      <w:r>
+        <w:t xml:space="preserve"> </w:t>
+      </w:r>
+      <w:r>
+        <w:rPr>
+          <w:rFonts w:ascii="Consolas" w:cs="Consolas" w:eastAsia="Consolas" w:hAnsi="Consolas"/>
+          <w:sz w:val="20"/>
+          <w:szCs w:val="20"/>
+        </w:rPr>
+        <w:t xml:space="preserve">ServicioUsuarios</w:t>
+      </w:r>
+      <w:r>
+        <w:t xml:space="preserve"> y </w:t>
+      </w:r>
+      <w:r>
+        <w:rPr>
+          <w:rFonts w:ascii="Consolas" w:cs="Consolas" w:eastAsia="Consolas" w:hAnsi="Consolas"/>
+          <w:sz w:val="20"/>
+          <w:szCs w:val="20"/>
+        </w:rPr>
+        <w:t xml:space="preserve">ServicioSeguridad</w:t>
+      </w:r>
+      <w:r>
+        <w:t xml:space="preserve">, en lugar de una clase por caso de uso.</w:t>
+      </w:r>
+    </w:p>
+    <w:p>
+      <w:pPr>
+        <w:pStyle w:val="ListParagraph"/>
+        <w:numPr>
+          <w:ilvl w:val="0"/>
+          <w:numId w:val="2"/>
+        </w:numPr>
+        <w:spacing w:after="60"/>
+        <w:jc w:val="left"/>
+      </w:pPr>
+      <w:r>
+        <w:rPr>
+          <w:b/>
+          <w:bCs/>
+        </w:rPr>
+        <w:t xml:space="preserve">Sin mapeador separado:</w:t>
+      </w:r>
+      <w:r>
+        <w:t xml:space="preserve"> el repositorio reconstruye la entidad desde la fila (</w:t>
+      </w:r>
+      <w:r>
+        <w:rPr>
+          <w:rFonts w:ascii="Consolas" w:cs="Consolas" w:eastAsia="Consolas" w:hAnsi="Consolas"/>
+          <w:sz w:val="20"/>
+          <w:szCs w:val="20"/>
+        </w:rPr>
+        <w:t xml:space="preserve">CuentaComercial.reconstruir</w:t>
+      </w:r>
+      <w:r>
+        <w:t xml:space="preserve"> en </w:t>
+      </w:r>
+      <w:r>
+        <w:rPr>
+          <w:rFonts w:ascii="Consolas" w:cs="Consolas" w:eastAsia="Consolas" w:hAnsi="Consolas"/>
+          <w:sz w:val="20"/>
+          <w:szCs w:val="20"/>
+        </w:rPr>
+        <w:t xml:space="preserve">repositorio-usuarios-pg.ts</w:t>
+      </w:r>
+      <w:r>
+        <w:t xml:space="preserve">).</w:t>
+      </w:r>
+    </w:p>
+    <w:p>
+      <w:pPr>
+        <w:pStyle w:val="ListParagraph"/>
+        <w:numPr>
+          <w:ilvl w:val="0"/>
+          <w:numId w:val="2"/>
+        </w:numPr>
+        <w:spacing w:after="60"/>
+        <w:jc w:val="left"/>
+      </w:pPr>
+      <w:r>
+        <w:rPr>
+          <w:b/>
+          <w:bCs/>
+        </w:rPr>
+        <w:t xml:space="preserve">Los puertos transversales se mantienen siempre:</w:t>
+      </w:r>
+      <w:r>
+        <w:t xml:space="preserve"> notificación, bandeja, bitácora y almacén. Las reglas </w:t>
+      </w:r>
+      <w:r>
+        <w:rPr>
+          <w:rFonts w:ascii="Consolas" w:cs="Consolas" w:eastAsia="Consolas" w:hAnsi="Consolas"/>
+          <w:sz w:val="20"/>
+          <w:szCs w:val="20"/>
+        </w:rPr>
+        <w:t xml:space="preserve">pa-01</w:t>
+      </w:r>
+      <w:r>
+        <w:t xml:space="preserve"> y </w:t>
+      </w:r>
+      <w:r>
+        <w:rPr>
+          <w:rFonts w:ascii="Consolas" w:cs="Consolas" w:eastAsia="Consolas" w:hAnsi="Consolas"/>
+          <w:sz w:val="20"/>
+          <w:szCs w:val="20"/>
+        </w:rPr>
+        <w:t xml:space="preserve">v-01</w:t>
+      </w:r>
+      <w:r>
+        <w:t xml:space="preserve"> no admiten excepción en ningún módulo.</w:t>
+      </w:r>
+    </w:p>
     <w:p>
       <w:pPr>
         <w:pStyle w:val="Heading2"/>
@@ -9907,6 +10075,15 @@
   <w:num w:numId="1">
     <w:abstractNumId w:val="1"/>
     <w:lvlOverride w:ilvl="0">
+      <w:startOverride w:val="1"/>
+    </w:lvlOverride>
+  </w:num>
+  <w:num w:numId="2">
+    <w:abstractNumId w:val="2"/>
+    <w:lvlOverride w:ilvl="0">
+      <w:startOverride w:val="1"/>
+    </w:lvlOverride>
+    <w:lvlOverride w:ilvl="1">
       <w:startOverride w:val="1"/>
     </w:lvlOverride>
   </w:num>

</xml_diff>

<commit_message>
docs(informes): regenera los informes con IT-02 integrada y SYS-FN-07 en revisión [SYS-FN-07] [PR #3] [PR #6]
Los informes 1, 2, 3, 4a, 4b y 6 citan la fusión 6d0f2d3 de IT-02 y la
ejecución 39042977012. SYS-FN-07 consta como construido y verificado en
it-02/bloqueo, pendiente de la revisión cruzada (DM-05), no como integrado.

Co-Authored-By: Claude Opus 5.5 <noreply@anthropic.com>
</commit_message>
<xml_diff>
--- a/docs/informes/Informe1_SOLID_AbasteceNi_v1.0.docx
+++ b/docs/informes/Informe1_SOLID_AbasteceNi_v1.0.docx
@@ -1207,7 +1207,7 @@
         <w:jc w:val="both"/>
       </w:pPr>
       <w:r>
-        <w:t xml:space="preserve">El alcance vigente es el de las iteraciones IT-00, IT-01 e IT-02 (tramo A) del documento 4 (D4 §2.13). Conforme a la Definición de Terminado (DM-04, condiciones 5 y 6), un elemento solo forma parte del incremento cuando la revisión cruzada consta como favorable y está integrado en la rama principal con la batería en verde. IT-00 e IT-01 están integradas en </w:t>
+        <w:t xml:space="preserve">El alcance vigente es el de las iteraciones IT-00, IT-01 e IT-02 (tramo A) del documento 4 (D4 §2.13). Conforme a la Definición de Terminado (DM-04, condiciones 5 y 6), un elemento solo forma parte del incremento cuando la revisión cruzada consta como favorable y está integrado en la rama principal con la batería en verde. IT-00, IT-01 e IT-02 (tramo A) están integradas en </w:t>
       </w:r>
       <w:r>
         <w:rPr>
@@ -1218,17 +1218,7 @@
         <w:t xml:space="preserve">main</w:t>
       </w:r>
       <w:r>
-        <w:t xml:space="preserve"> (PR #1 y #2). IT-02 (tramo A) está </w:t>
-      </w:r>
-      <w:r>
-        <w:rPr>
-          <w:b/>
-          <w:bCs/>
-        </w:rPr>
-        <w:t xml:space="preserve">construida y verificada, pendiente de la revisión cruzada</w:t>
-      </w:r>
-      <w:r>
-        <w:t xml:space="preserve"> (PR #3) para integrarse (DM-04, condiciones 5 y 6), y por eso se presenta como construida en rama y no como parte del incremento integrado. Cada afirmación del Desarrollo indica a qué iteración pertenece:</w:t>
+        <w:t xml:space="preserve"> (PR #1, #2 y #3), con la batería en verde. Cada afirmación del Desarrollo indica a qué iteración pertenece:</w:t>
       </w:r>
     </w:p>
     <w:tbl>
@@ -1815,7 +1805,37 @@
                 <w:sz w:val="18"/>
                 <w:szCs w:val="18"/>
               </w:rPr>
-              <w:t xml:space="preserve">Construida y verificada; pendiente de la revisión cruzada (DM-05) para integrarse</w:t>
+              <w:t xml:space="preserve">Integrada en </w:t>
+            </w:r>
+            <w:r>
+              <w:rPr>
+                <w:rFonts w:ascii="Consolas" w:cs="Consolas" w:eastAsia="Consolas" w:hAnsi="Consolas"/>
+                <w:sz w:val="18"/>
+                <w:szCs w:val="18"/>
+              </w:rPr>
+              <w:t xml:space="preserve">main</w:t>
+            </w:r>
+            <w:r>
+              <w:rPr>
+                <w:sz w:val="18"/>
+                <w:szCs w:val="18"/>
+              </w:rPr>
+              <w:t xml:space="preserve"> (commit de fusión </w:t>
+            </w:r>
+            <w:r>
+              <w:rPr>
+                <w:rFonts w:ascii="Consolas" w:cs="Consolas" w:eastAsia="Consolas" w:hAnsi="Consolas"/>
+                <w:sz w:val="18"/>
+                <w:szCs w:val="18"/>
+              </w:rPr>
+              <w:t xml:space="preserve">6d0f2d3</w:t>
+            </w:r>
+            <w:r>
+              <w:rPr>
+                <w:sz w:val="18"/>
+                <w:szCs w:val="18"/>
+              </w:rPr>
+              <w:t xml:space="preserve">)</w:t>
             </w:r>
           </w:p>
         </w:tc>
@@ -4027,7 +4047,7 @@
           <w:sz w:val="20"/>
           <w:szCs w:val="20"/>
         </w:rPr>
-        <w:t xml:space="preserve">composicion/api.module.ts:85-90</w:t>
+        <w:t xml:space="preserve">composicion/api.module.ts:123-128</w:t>
       </w:r>
       <w:r>
         <w:t xml:space="preserve">). Ningún controlador contiene lógica de autenticación, de límite ni de traducción de errores.</w:t>
@@ -4333,7 +4353,7 @@
           <w:sz w:val="20"/>
           <w:szCs w:val="20"/>
         </w:rPr>
-        <w:t xml:space="preserve">trabajador.module.ts:80</w:t>
+        <w:t xml:space="preserve">trabajador.module.ts:95-99</w:t>
       </w:r>
       <w:r>
         <w:t xml:space="preserve">). La evidencia más fuerte la aportó la propia construcción: en IT-02 se añadieron los avisos de aprobación y de rechazo (</w:t>
@@ -4347,7 +4367,29 @@
         <w:t xml:space="preserve">manejadores/notificar-decision-cuenta.ts</w:t>
       </w:r>
       <w:r>
-        <w:t xml:space="preserve">, DIS-30) registrándolos en la composición, </w:t>
+        <w:t xml:space="preserve">, DIS-30) y, con SYS-FN-07, el aviso de bloqueo por el canal de correo (</w:t>
+      </w:r>
+      <w:r>
+        <w:rPr>
+          <w:rFonts w:ascii="Consolas" w:cs="Consolas" w:eastAsia="Consolas" w:hAnsi="Consolas"/>
+          <w:sz w:val="20"/>
+          <w:szCs w:val="20"/>
+        </w:rPr>
+        <w:t xml:space="preserve">manejadores/notificar-cuenta-bloqueada.ts</w:t>
+      </w:r>
+      <w:r>
+        <w:t xml:space="preserve">, construido y verificado en la rama </w:t>
+      </w:r>
+      <w:r>
+        <w:rPr>
+          <w:rFonts w:ascii="Consolas" w:cs="Consolas" w:eastAsia="Consolas" w:hAnsi="Consolas"/>
+          <w:sz w:val="20"/>
+          <w:szCs w:val="20"/>
+        </w:rPr>
+        <w:t xml:space="preserve">it-02/bloqueo</w:t>
+      </w:r>
+      <w:r>
+        <w:t xml:space="preserve">, pendiente de la revisión cruzada (PR #6)), registrándolos en la composición </w:t>
       </w:r>
       <w:r>
         <w:rPr>
@@ -8670,7 +8712,7 @@
                 <w:sz w:val="18"/>
                 <w:szCs w:val="18"/>
               </w:rPr>
-              <w:t xml:space="preserve">Pendiente de revisión cruzada (PR #3)</w:t>
+              <w:t xml:space="preserve">Integrado (PR #3)</w:t>
             </w:r>
           </w:p>
         </w:tc>
@@ -8817,7 +8859,7 @@
                 <w:sz w:val="18"/>
                 <w:szCs w:val="18"/>
               </w:rPr>
-              <w:t xml:space="preserve">IT-01 integrado; IT-02 pendiente (PR #3)</w:t>
+              <w:t xml:space="preserve">Integrado (PR #2 y #3)</w:t>
             </w:r>
           </w:p>
         </w:tc>
@@ -8976,17 +9018,7 @@
         <w:jc w:val="both"/>
       </w:pPr>
       <w:r>
-        <w:t xml:space="preserve">Los elementos de IT-02 están construidos y su verificación está en verde en la CI de su rama, pero </w:t>
-      </w:r>
-      <w:r>
-        <w:rPr>
-          <w:b/>
-          <w:bCs/>
-        </w:rPr>
-        <w:t xml:space="preserve">no se presentan como parte del incremento</w:t>
-      </w:r>
-      <w:r>
-        <w:t xml:space="preserve"> hasta que la revisión cruzada de DM-05 conste como favorable y se integren en </w:t>
+        <w:t xml:space="preserve">Todos los elementos evidenciados están integrados en </w:t>
       </w:r>
       <w:r>
         <w:rPr>
@@ -8997,7 +9029,7 @@
         <w:t xml:space="preserve">main</w:t>
       </w:r>
       <w:r>
-        <w:t xml:space="preserve">, conforme a las condiciones 5 y 6 de DM-04.</w:t>
+        <w:t xml:space="preserve"> con la batería en verde (DM-04, condiciones 5 y 6).</w:t>
       </w:r>
     </w:p>
     <w:p>

</xml_diff>

<commit_message>
docs(informes): regenera los informes con SYS-FN-07 integrado y todas las discrepancias resueltas [SYS-FN-07] [PR #6] [DIS-35]
Co-Authored-By: Claude Opus 5.5 <noreply@anthropic.com>
</commit_message>
<xml_diff>
--- a/docs/informes/Informe1_SOLID_AbasteceNi_v1.0.docx
+++ b/docs/informes/Informe1_SOLID_AbasteceNi_v1.0.docx
@@ -1218,7 +1218,7 @@
         <w:t xml:space="preserve">main</w:t>
       </w:r>
       <w:r>
-        <w:t xml:space="preserve"> (PR #1, #2 y #3), con la batería en verde. Cada afirmación del Desarrollo indica a qué iteración pertenece:</w:t>
+        <w:t xml:space="preserve"> (PR #1, #2 y #3), con la batería en verde. Del tramo B, SYS-FN-07 también está integrado (PR #6). Cada afirmación del Desarrollo indica a qué iteración pertenece:</w:t>
       </w:r>
     </w:p>
     <w:tbl>
@@ -4378,18 +4378,29 @@
         <w:t xml:space="preserve">manejadores/notificar-cuenta-bloqueada.ts</w:t>
       </w:r>
       <w:r>
-        <w:t xml:space="preserve">, construido y verificado en la rama </w:t>
-      </w:r>
-      <w:r>
-        <w:rPr>
-          <w:rFonts w:ascii="Consolas" w:cs="Consolas" w:eastAsia="Consolas" w:hAnsi="Consolas"/>
-          <w:sz w:val="20"/>
-          <w:szCs w:val="20"/>
-        </w:rPr>
-        <w:t xml:space="preserve">it-02/bloqueo</w:t>
-      </w:r>
-      <w:r>
-        <w:t xml:space="preserve">, pendiente de la revisión cruzada (PR #6)), registrándolos en la composición </w:t>
+        <w:t xml:space="preserve">, integrado en </w:t>
+      </w:r>
+      <w:r>
+        <w:rPr>
+          <w:rFonts w:ascii="Consolas" w:cs="Consolas" w:eastAsia="Consolas" w:hAnsi="Consolas"/>
+          <w:sz w:val="20"/>
+          <w:szCs w:val="20"/>
+        </w:rPr>
+        <w:t xml:space="preserve">main</w:t>
+      </w:r>
+      <w:r>
+        <w:t xml:space="preserve"> con la PR #6, fusión </w:t>
+      </w:r>
+      <w:r>
+        <w:rPr>
+          <w:rFonts w:ascii="Consolas" w:cs="Consolas" w:eastAsia="Consolas" w:hAnsi="Consolas"/>
+          <w:sz w:val="20"/>
+          <w:szCs w:val="20"/>
+        </w:rPr>
+        <w:t xml:space="preserve">2bd1b3e</w:t>
+      </w:r>
+      <w:r>
+        <w:t xml:space="preserve">), registrándolos en la composición </w:t>
       </w:r>
       <w:r>
         <w:rPr>

</xml_diff>